<commit_message>
Give the demo lease its plan and parking, and mark the offer without prejudice
The correspondence promises Unit 4's lease plan and parking spaces 7 and 8, but no
version of the lease granted them, and the draft's clause 6.2 had its number outside
its tracked insertion, which the Previews page's screenshot shows. The draft, the
engrossment and the counterpart now define the Plan and grant the spaces (the
engrossment's plan is revision A, with the bin store moved east), and 6.2's number is
inside the insertion. Its comment now reads as a comment on Helen's insertion.

Tom Reeve's letter of 23 September offers settlement, so it's marked "Without
prejudice save as to costs", and the particulars of claim no longer plead the offer.
The seven files are rebuilt with build.py.

Co-Authored-By: Claude Opus 5.5 <noreply@anthropic.com>
</commit_message>
<xml_diff>
--- a/docker/demo/files/brightwell-lease-draft.docx
+++ b/docker/demo/files/brightwell-lease-draft.docx
@@ -239,7 +239,7 @@
             </w:pPr>
             <w:r>
               <w:rPr/>
-              <w:t>Unit 4, Weir Lane Trading Estate, Marlbridge WX2 6DN, with its yard and the loading bay in front of it.</w:t>
+              <w:t>Unit 4, Weir Lane Trading Estate, Marlbridge WX2 6DN, shown edged red on the Plan, with its yard and the loading bay in front of it.</w:t>
             </w:r>
           </w:p>
         </w:tc>
@@ -501,6 +501,25 @@
         <w:rPr>
           <w:rStyle w:val="Strong"/>
         </w:rPr>
+        <w:t>Plan</w:t>
+      </w:r>
+      <w:r>
+        <w:rPr/>
+        <w:t xml:space="preserve"> means the plan annexed to this lease, drawing WL/04/01.</w:t>
+      </w:r>
+    </w:p>
+    <w:p>
+      <w:pPr>
+        <w:pStyle w:val="Definition"/>
+        <w:bidi w:val="0"/>
+        <w:ind w:left="624"/>
+        <w:jc w:val="both"/>
+        <w:rPr/>
+      </w:pPr>
+      <w:r>
+        <w:rPr>
+          <w:rStyle w:val="Strong"/>
+        </w:rPr>
         <w:t>Premises</w:t>
       </w:r>
       <w:r>
@@ -643,7 +662,7 @@
         <w:rPr/>
         <w:t>2.2</w:t>
         <w:tab/>
-        <w:t>The Tenant may, in common with the Landlord and others, use the estate road to reach the Premises, and may display a sign for its business at the entrance to the estate.</w:t>
+        <w:t>The Tenant may, in common with the Landlord and others, use the estate road to reach the Premises, may park two private vehicles in the spaces numbered 7 and 8 and shaded on the Plan, and may display a sign for its business at the entrance to the estate.</w:t>
       </w:r>
     </w:p>
     <w:p>
@@ -1025,22 +1044,26 @@
         <w:ind w:hanging="624" w:left="624"/>
         <w:jc w:val="both"/>
         <w:rPr>
-          <w:ins w:id="14" w:author="Helen Ashcombe" w:date="2026-09-17T09:40:00Z"/>
+          <w:ins w:id="16" w:author="Helen Ashcombe" w:date="2026-09-17T09:40:00Z"/>
         </w:rPr>
       </w:pPr>
       <w:commentRangeStart w:id="1"/>
-      <w:r>
-        <w:rPr/>
-        <w:t>6.2</w:t>
-      </w:r>
-      <w:r>
-        <w:rPr/>
-      </w:r>
+      <w:ins w:id="13" w:author="Helen Ashcombe" w:date="2026-09-17T09:40:00Z">
+        <w:r>
+          <w:rPr/>
+          <w:t>6.2</w:t>
+        </w:r>
+      </w:ins>
+      <w:ins w:id="14" w:author="Helen Ashcombe" w:date="2026-09-17T09:40:00Z">
+        <w:r>
+          <w:rPr/>
+        </w:r>
+      </w:ins>
       <w:commentRangeEnd w:id="1"/>
       <w:r>
         <w:commentReference w:id="1"/>
       </w:r>
-      <w:ins w:id="13" w:author="Helen Ashcombe" w:date="2026-09-17T09:40:00Z">
+      <w:ins w:id="15" w:author="Helen Ashcombe" w:date="2026-09-17T09:40:00Z">
         <w:r>
           <w:rPr/>
           <w:tab/>
@@ -1367,7 +1390,7 @@
       </w:r>
       <w:r>
         <w:rPr/>
-        <w:t>Helen, the heads of terms said nothing about a break. Should we ask for one at year five, or keep it to trade against the rent review?</w:t>
+        <w:t>Helen, the heads of terms said nothing about a break, so the landlord may resist this. Do we keep it in, or hold it back to trade against the rent review?</w:t>
       </w:r>
     </w:p>
   </w:comment>

</xml_diff>

<commit_message>
Anchor the demo lease's comments to whole clauses
A preview draws a comment's icon where its anchored text ends. Anchored to "a yearly
rent of" and to "6.2", the icons covered the deleted £48,000 and the start of the
inserted clause 6.2, which the Previews page's screenshot shows. Each comment now
spans its whole clause, so its icon follows the clause's last word.

Co-Authored-By: Claude Opus 5.5 <noreply@anthropic.com>
</commit_message>
<xml_diff>
--- a/docker/demo/files/brightwell-lease-draft.docx
+++ b/docker/demo/files/brightwell-lease-draft.docx
@@ -714,18 +714,7 @@
       <w:commentRangeStart w:id="0"/>
       <w:r>
         <w:rPr/>
-        <w:t>a yearly rent of</w:t>
-      </w:r>
-      <w:r>
-        <w:rPr/>
-      </w:r>
-      <w:commentRangeEnd w:id="0"/>
-      <w:r>
-        <w:commentReference w:id="0"/>
-      </w:r>
-      <w:r>
-        <w:rPr/>
-        <w:t xml:space="preserve"> </w:t>
+        <w:t xml:space="preserve">a yearly rent of </w:t>
       </w:r>
       <w:del w:id="0" w:author="Priya Nair" w:date="2026-09-15T16:20:00Z">
         <w:r>
@@ -743,6 +732,13 @@
         <w:rPr/>
         <w:t xml:space="preserve"> plus VAT, in equal quarterly instalments in advance on 1 January, 1 April, 1 July and 1 October. The first instalment is due on the Term Start Date, for the period up to the next quarter day.</w:t>
       </w:r>
+      <w:commentRangeEnd w:id="0"/>
+      <w:r>
+        <w:commentReference w:id="0"/>
+      </w:r>
+      <w:r>
+        <w:rPr/>
+      </w:r>
     </w:p>
     <w:p>
       <w:pPr>
@@ -1044,7 +1040,7 @@
         <w:ind w:hanging="624" w:left="624"/>
         <w:jc w:val="both"/>
         <w:rPr>
-          <w:ins w:id="16" w:author="Helen Ashcombe" w:date="2026-09-17T09:40:00Z"/>
+          <w:ins w:id="15" w:author="Helen Ashcombe" w:date="2026-09-17T09:40:00Z"/>
         </w:rPr>
       </w:pPr>
       <w:commentRangeStart w:id="1"/>
@@ -1052,22 +1048,17 @@
         <w:r>
           <w:rPr/>
           <w:t>6.2</w:t>
+          <w:tab/>
+          <w:t>The Tenant may end this lease on the fifth anniversary of the Term Start Date by giving the Landlord at least six months’ written notice, if it has paid the Rent and has carried out its obligations in this lease up to that date.</w:t>
         </w:r>
       </w:ins>
+      <w:commentRangeEnd w:id="1"/>
+      <w:r>
+        <w:commentReference w:id="1"/>
+      </w:r>
       <w:ins w:id="14" w:author="Helen Ashcombe" w:date="2026-09-17T09:40:00Z">
         <w:r>
           <w:rPr/>
-        </w:r>
-      </w:ins>
-      <w:commentRangeEnd w:id="1"/>
-      <w:r>
-        <w:commentReference w:id="1"/>
-      </w:r>
-      <w:ins w:id="15" w:author="Helen Ashcombe" w:date="2026-09-17T09:40:00Z">
-        <w:r>
-          <w:rPr/>
-          <w:tab/>
-          <w:t>The Tenant may end this lease on the fifth anniversary of the Term Start Date by giving the Landlord at least six months’ written notice, if it has paid the Rent and has carried out its obligations in this lease up to that date.</w:t>
         </w:r>
       </w:ins>
     </w:p>

</xml_diff>